<commit_message>
updating footer and portfolio
</commit_message>
<xml_diff>
--- a/resume/JeremyMParkerCoverLetter.docx
+++ b/resume/JeremyMParkerCoverLetter.docx
@@ -3,82 +3,150 @@
 <w:document xmlns:wpc="http://schemas.microsoft.com/office/word/2010/wordprocessingCanvas" xmlns:cx="http://schemas.microsoft.com/office/drawing/2014/chartex" xmlns:cx1="http://schemas.microsoft.com/office/drawing/2015/9/8/chartex" xmlns:cx2="http://schemas.microsoft.com/office/drawing/2015/10/21/chartex" xmlns:cx3="http://schemas.microsoft.com/office/drawing/2016/5/9/chartex" xmlns:cx4="http://schemas.microsoft.com/office/drawing/2016/5/10/chartex" xmlns:cx5="http://schemas.microsoft.com/office/drawing/2016/5/11/chartex" xmlns:cx6="http://schemas.microsoft.com/office/drawing/2016/5/12/chartex" xmlns:cx7="http://schemas.microsoft.com/office/drawing/2016/5/13/chartex" xmlns:cx8="http://schemas.microsoft.com/office/drawing/2016/5/14/chartex" xmlns:mc="http://schemas.openxmlformats.org/markup-compatibility/2006" xmlns:aink="http://schemas.microsoft.com/office/drawing/2016/ink" xmlns:am3d="http://schemas.microsoft.com/office/drawing/2017/model3d" xmlns:o="urn:schemas-microsoft-com:office:office" xmlns:oel="http://schemas.microsoft.com/office/2019/extlst" xmlns:r="http://schemas.openxmlformats.org/officeDocument/2006/relationships" xmlns:m="http://schemas.openxmlformats.org/officeDocument/2006/math" xmlns:v="urn:schemas-microsoft-com:vml" xmlns:wp14="http://schemas.microsoft.com/office/word/2010/wordprocessingDrawing" xmlns:wp="http://schemas.openxmlformats.org/drawingml/2006/wordprocessingDrawing" xmlns:w10="urn:schemas-microsoft-com:office:word" xmlns:w="http://schemas.openxmlformats.org/wordprocessingml/2006/main" xmlns:w14="http://schemas.microsoft.com/office/word/2010/wordml" xmlns:w15="http://schemas.microsoft.com/office/word/2012/wordml" xmlns:w16cex="http://schemas.microsoft.com/office/word/2018/wordml/cex" xmlns:w16cid="http://schemas.microsoft.com/office/word/2016/wordml/cid" xmlns:w16="http://schemas.microsoft.com/office/word/2018/wordml" xmlns:w16du="http://schemas.microsoft.com/office/word/2023/wordml/word16du" xmlns:w16sdtdh="http://schemas.microsoft.com/office/word/2020/wordml/sdtdatahash" xmlns:w16sdtfl="http://schemas.microsoft.com/office/word/2024/wordml/sdtformatlock" xmlns:w16se="http://schemas.microsoft.com/office/word/2015/wordml/symex" xmlns:wpg="http://schemas.microsoft.com/office/word/2010/wordprocessingGroup" xmlns:wpi="http://schemas.microsoft.com/office/word/2010/wordprocessingInk" xmlns:wne="http://schemas.microsoft.com/office/word/2006/wordml" xmlns:wps="http://schemas.microsoft.com/office/word/2010/wordprocessingShape" mc:Ignorable="w14 w15 w16se w16cid w16 w16cex w16sdtdh w16sdtfl w16du wp14">
   <w:body>
     <w:p>
-      <w:r>
-        <w:t xml:space="preserve">I love writing cover letters. I believe </w:t>
-      </w:r>
-      <w:r>
-        <w:t xml:space="preserve">that </w:t>
-      </w:r>
-      <w:r>
-        <w:t xml:space="preserve">passing the vibe check is a great </w:t>
-      </w:r>
-      <w:r>
-        <w:t>first step</w:t>
-      </w:r>
-      <w:r>
-        <w:t xml:space="preserve"> in us interviewing </w:t>
-      </w:r>
-      <w:r>
-        <w:t>each</w:t>
-      </w:r>
-      <w:r>
-        <w:t xml:space="preserve"> other. Once we have communication, I </w:t>
-      </w:r>
-      <w:r>
-        <w:t>will</w:t>
-      </w:r>
-      <w:r>
-        <w:t xml:space="preserve"> then respond with a full cover letter outlining everything about the position and the company I am excited to bring. I will market myself</w:t>
-      </w:r>
-      <w:r>
-        <w:t xml:space="preserve"> backed with metrics </w:t>
-      </w:r>
-      <w:r>
-        <w:t>using all the information gained from that introductory conversation. Instead of you getting yet another boring boilerplate babbling of big words, likely written artificially. Most importantly, I bring commitment to the project, to the business, and to my team.</w:t>
+      <w:pPr>
+        <w:rPr>
+          <w:rFonts w:ascii="Perfect DOS VGA 437 Win" w:hAnsi="Perfect DOS VGA 437 Win"/>
+          <w:color w:val="404040" w:themeColor="text1" w:themeTint="BF"/>
+        </w:rPr>
+      </w:pPr>
+      <w:r>
+        <w:rPr>
+          <w:rFonts w:ascii="Perfect DOS VGA 437 Win" w:hAnsi="Perfect DOS VGA 437 Win"/>
+          <w:color w:val="404040" w:themeColor="text1" w:themeTint="BF"/>
+        </w:rPr>
+        <w:t>npx create-react-router@</w:t>
+      </w:r>
+      <w:r>
+        <w:rPr>
+          <w:rFonts w:ascii="Perfect DOS VGA 437 Win" w:hAnsi="Perfect DOS VGA 437 Win"/>
+          <w:color w:val="404040" w:themeColor="text1" w:themeTint="BF"/>
+        </w:rPr>
+        <w:t>jeremy_parker_coverletter</w:t>
       </w:r>
     </w:p>
     <w:p>
-      <w:r>
-        <w:t>My work history has been project</w:t>
-      </w:r>
-      <w:r>
-        <w:t>-</w:t>
-      </w:r>
-      <w:r>
-        <w:t xml:space="preserve">focused after longer stints early on in my career. The </w:t>
-      </w:r>
-      <w:r>
-        <w:t>reason</w:t>
-      </w:r>
-      <w:r>
-        <w:t xml:space="preserve"> for that </w:t>
-      </w:r>
-      <w:r>
-        <w:t>was</w:t>
-      </w:r>
-      <w:r>
-        <w:t xml:space="preserve"> my choice to seek out as many different projects as I could in different fields to hone my core skillset. I have this root desire to learn as much as I can about this world. Granted that's made me a jack-of-all trades and that experience is hard to come by.</w:t>
+      <w:pPr>
+        <w:rPr>
+          <w:rFonts w:ascii="Perfect DOS VGA 437" w:hAnsi="Perfect DOS VGA 437"/>
+          <w:i/>
+          <w:iCs/>
+        </w:rPr>
+      </w:pPr>
+      <w:r>
+        <w:rPr>
+          <w:rFonts w:ascii="Perfect DOS VGA 437" w:hAnsi="Perfect DOS VGA 437"/>
+          <w:i/>
+          <w:iCs/>
+        </w:rPr>
+        <w:t>....</w:t>
       </w:r>
     </w:p>
     <w:p>
       <w:r>
-        <w:t xml:space="preserve">I am looking to </w:t>
-      </w:r>
-      <w:r>
-        <w:t>relocate,</w:t>
-      </w:r>
-      <w:r>
-        <w:t xml:space="preserve"> and I can make this move within a couple of weeks.</w:t>
+        <w:t xml:space="preserve">I do my best to be original and fresh, always trying out new ways to achieve high goals and better receipts. This cover letter is one of those attempts. Just so you know I put time and care into each application, I am applying for the role of </w:t>
+      </w:r>
+      <w:r>
+        <w:t>Lead Software Engineer (Manager) - React/Typescript/CSS</w:t>
+      </w:r>
+      <w:r>
+        <w:t xml:space="preserve"> </w:t>
+      </w:r>
+      <w:r>
+        <w:t xml:space="preserve">at </w:t>
+      </w:r>
+      <w:r>
+        <w:t>JPMorgan Chase</w:t>
+      </w:r>
+      <w:r>
+        <w:t>.</w:t>
       </w:r>
     </w:p>
     <w:p>
       <w:r>
-        <w:t>Thanks for your consideration!</w:t>
+        <w:t xml:space="preserve">I love writing cover letters. I believe </w:t>
+      </w:r>
+      <w:r>
+        <w:t xml:space="preserve">that </w:t>
+      </w:r>
+      <w:r>
+        <w:t xml:space="preserve">passing the vibe check is a great </w:t>
+      </w:r>
+      <w:r>
+        <w:t>first step</w:t>
+      </w:r>
+      <w:r>
+        <w:t xml:space="preserve"> in us interviewing </w:t>
+      </w:r>
+      <w:r>
+        <w:t>each</w:t>
+      </w:r>
+      <w:r>
+        <w:t xml:space="preserve"> other. Once we have communication, I </w:t>
+      </w:r>
+      <w:r>
+        <w:t>will</w:t>
+      </w:r>
+      <w:r>
+        <w:t xml:space="preserve"> then respond with a full cover letter outlining everything about the position and the company I am excited to bring. I will market myself</w:t>
+      </w:r>
+      <w:r>
+        <w:t xml:space="preserve"> backed with metrics </w:t>
+      </w:r>
+      <w:r>
+        <w:t>using all the information gained from that introductory conversation. Instead of you getting yet another boring boilerplate babbling of big words, likely written artificially. Most importantly, I bring commitment to the project, to the business, and to my team.</w:t>
       </w:r>
     </w:p>
     <w:p>
       <w:r>
-        <w:t xml:space="preserve">Full project and user stories with data are available on my website with portfolio and resume: </w:t>
+        <w:t>My work history has been project</w:t>
+      </w:r>
+      <w:r>
+        <w:t>-</w:t>
+      </w:r>
+      <w:r>
+        <w:t xml:space="preserve">focused after longer stints early on in my career. The </w:t>
+      </w:r>
+      <w:r>
+        <w:t>reason</w:t>
+      </w:r>
+      <w:r>
+        <w:t xml:space="preserve"> for that </w:t>
+      </w:r>
+      <w:r>
+        <w:t>was</w:t>
+      </w:r>
+      <w:r>
+        <w:t xml:space="preserve"> my choice to seek out as many different projects as I could in different fields to hone my core skillset. I have this root desire to learn as much as I can about this world. Granted that's made me a jack-of-all trades and that experience is hard to come by.</w:t>
+      </w:r>
+    </w:p>
+    <w:p>
+      <w:r>
+        <w:t xml:space="preserve">I am looking to </w:t>
+      </w:r>
+      <w:r>
+        <w:t>relocate,</w:t>
+      </w:r>
+      <w:r>
+        <w:t xml:space="preserve"> and I can make this move within a couple of weeks.</w:t>
+      </w:r>
+      <w:r>
+        <w:t xml:space="preserve"> </w:t>
+      </w:r>
+    </w:p>
+    <w:p>
+      <w:r>
+        <w:t>Thanks for your consideration!</w:t>
+      </w:r>
+    </w:p>
+    <w:p>
+      <w:r>
+        <w:t xml:space="preserve">Full project and user stories with data are available on my website with portfolio and </w:t>
+      </w:r>
+      <w:r>
+        <w:t>reviews</w:t>
+      </w:r>
+      <w:r>
+        <w:t xml:space="preserve">: </w:t>
       </w:r>
       <w:hyperlink r:id="rId4" w:history="1">
         <w:r>
@@ -702,7 +770,6 @@
   <w:style w:type="character" w:default="1" w:styleId="DefaultParagraphFont">
     <w:name w:val="Default Paragraph Font"/>
     <w:uiPriority w:val="1"/>
-    <w:semiHidden/>
     <w:unhideWhenUsed/>
   </w:style>
   <w:style w:type="table" w:default="1" w:styleId="TableNormal">

</xml_diff>